<commit_message>
Created a Kmeans clustering model
</commit_message>
<xml_diff>
--- a/ML with python - KMeans Clustering/ML with Python - K Means Clustering.docx
+++ b/ML with python - KMeans Clustering/ML with Python - K Means Clustering.docx
@@ -81,7 +81,19 @@
         <w:rPr>
           <w:lang w:val="en-US"/>
         </w:rPr>
-        <w:t>It’s a unsupervised learning which is used to categorize or segment data into subgroups based on the similarity.</w:t>
+        <w:t>It’s a</w:t>
+      </w:r>
+      <w:r>
+        <w:rPr>
+          <w:lang w:val="en-US"/>
+        </w:rPr>
+        <w:t>n</w:t>
+      </w:r>
+      <w:r>
+        <w:rPr>
+          <w:lang w:val="en-US"/>
+        </w:rPr>
+        <w:t xml:space="preserve"> unsupervised learning which is used to categorize or segment data into subgroups based on the similarity.</w:t>
       </w:r>
     </w:p>
     <w:p>
@@ -421,6 +433,56 @@
           <w:lang w:val="en-US"/>
         </w:rPr>
         <w:t>This process is repeated until the convergence occurs. Then the final clusters we need are formed.</w:t>
+      </w:r>
+    </w:p>
+    <w:p>
+      <w:pPr>
+        <w:rPr>
+          <w:lang w:val="en-US"/>
+        </w:rPr>
+      </w:pPr>
+    </w:p>
+    <w:p>
+      <w:pPr>
+        <w:rPr>
+          <w:b/>
+          <w:bCs/>
+          <w:lang w:val="en-US"/>
+        </w:rPr>
+      </w:pPr>
+      <w:r>
+        <w:rPr>
+          <w:b/>
+          <w:bCs/>
+          <w:lang w:val="en-US"/>
+        </w:rPr>
+        <w:t>How to choose right K:</w:t>
+      </w:r>
+    </w:p>
+    <w:p>
+      <w:pPr>
+        <w:rPr>
+          <w:lang w:val="en-US"/>
+        </w:rPr>
+      </w:pPr>
+      <w:r>
+        <w:rPr>
+          <w:lang w:val="en-US"/>
+        </w:rPr>
+        <w:t>Either business requirements or prior knowledge about the data.</w:t>
+      </w:r>
+    </w:p>
+    <w:p>
+      <w:pPr>
+        <w:rPr>
+          <w:lang w:val="en-US"/>
+        </w:rPr>
+      </w:pPr>
+      <w:r>
+        <w:rPr>
+          <w:lang w:val="en-US"/>
+        </w:rPr>
+        <w:t>If not known about the prior knowledge, then use a simple rule k=~sq(n/2)</w:t>
       </w:r>
     </w:p>
     <w:sectPr>

</xml_diff>